<commit_message>
docs(bdr): keep withdrawal decisions inside the table
Follow-up to #280: remove the blank line before T-94 and regenerate the BDR export.
</commit_message>
<xml_diff>
--- a/docs/BACKLOG DECISION REVIEW CAA 161026.docx
+++ b/docs/BACKLOG DECISION REVIEW CAA 161026.docx
@@ -15260,20 +15260,6 @@
           </w:p>
         </w:tc>
       </w:tr>
-    </w:tbl>
-    <w:tbl>
-      <w:tblPr>
-        <w:tblStyle w:val="TableGrid"/>
-        <w:tblW w:type="auto" w:w="0"/>
-        <w:tblLook w:firstColumn="1" w:firstRow="1" w:lastColumn="0" w:lastRow="0" w:noHBand="0" w:noVBand="1" w:val="04A0"/>
-      </w:tblPr>
-      <w:tblGrid>
-        <w:gridCol w:w="1728"/>
-        <w:gridCol w:w="1728"/>
-        <w:gridCol w:w="1728"/>
-        <w:gridCol w:w="1728"/>
-        <w:gridCol w:w="1728"/>
-      </w:tblGrid>
       <w:tr>
         <w:tc>
           <w:tcPr>

</xml_diff>

<commit_message>
docs(bdr): refresh 16 October decision export
</commit_message>
<xml_diff>
--- a/docs/BACKLOG DECISION REVIEW CAA 161026.docx
+++ b/docs/BACKLOG DECISION REVIEW CAA 161026.docx
@@ -28,7 +28,7 @@
     </w:p>
     <w:p>
       <w:r>
-        <w:t>Version 9  ·  13 October 2026</w:t>
+        <w:t>Version 10  ·  16 October 2026</w:t>
       </w:r>
     </w:p>
     <w:p>
@@ -101,6 +101,27 @@
     <w:p>
       <w:r>
         <w:t>See [team decisions](B-team-decisions.md) and [change log](G-change-log.md).</w:t>
+      </w:r>
+    </w:p>
+    <w:p>
+      <w:pPr>
+        <w:pStyle w:val="Heading2"/>
+      </w:pPr>
+      <w:r>
+        <w:rPr>
+          <w:sz w:val="28"/>
+        </w:rPr>
+        <w:t>What changed in version 10</w:t>
+      </w:r>
+    </w:p>
+    <w:p>
+      <w:r>
+        <w:t>Recorded the Product Owner's 16 October approvals as T-97. The existing public/shared `seedCredential` risk is accepted for DEMO ONLY accounts, with no security-safety claim, real-data approval, rotation/access restriction selection, or approval of DB/API/service/CI secrets. The current main seed already defines both new roles; the accompanying runbook permits only a targeted, reviewed Safety Officer account operation if a read-only precheck shows that profile is missing, otherwise it records a no-op. Two Sprint 3 follow-ups, E14-S03 and E03-S12, are approved for separate refinement; E14-S02, E03-S07 and E03-S11 stay Done under the current Definition of Done, superseding T-74's historical reopening exception without erasing it. This is planning approval, not delivery evidence. Bryan is accountable PO for the SCRUM-75 Venue Staff mapping follow-up; roster assignments still require an approved actual mapping, and T-89's no-screen decision stands. PR #272's merged routing code is not blocked by that future mapping.</w:t>
+      </w:r>
+    </w:p>
+    <w:p>
+      <w:r>
+        <w:t>The canonical Markdown remains authoritative. BDR export `BACKLOG DECISION REVIEW CAA 161026.docx` is regenerated from these sources; the dated ADR export remains unchanged.</w:t>
       </w:r>
     </w:p>
     <w:p>
@@ -296,17 +317,17 @@
     </w:p>
     <w:p>
       <w:r>
-        <w:t>C-01 to C-70 — customer clarifications. C-01 to C-64 are taken from the Week 2 and Week 4 Q&amp;A spreadsheets and numbered in their own row order so any entry can be checked against the source file; C-65 to C-70 are the six items of the Week 7 Customer Changes document, in document order. C-71 to C-136 are the Week 9 Q&amp;A rows in workbook order.</w:t>
+        <w:t>C-01 to C-136 — customer clarifications. C-01 to C-64 are taken from the Week 2 and Week 4 Q&amp;A spreadsheets and numbered in their own row order so any entry can be checked against the source file; C-65 to C-70 are the six items of the Week 7 Customer Changes document, in document order. C-71 to C-136 are the Week 9 Q&amp;A rows in workbook order.</w:t>
       </w:r>
     </w:p>
     <w:p>
       <w:r>
-        <w:t>T-01 to T-91 — team decisions, each naming the clarification it follows from or the gap it closes.</w:t>
+        <w:t>T-01 to T-97 — team decisions, each naming the clarification it follows from or the gap it closes.</w:t>
       </w:r>
     </w:p>
     <w:p>
       <w:r>
-        <w:t>O-01 to O-49 — questions and standing assumptions, including items closed with the answer recorded against them. O-20 to O-44 were raised from Week 7 and are reconciled against Week 9; O-45 to O-49 record remaining Week 9 gaps and design dependencies.</w:t>
+        <w:t>O-01 to O-51 — questions and standing assumptions, including items closed with the answer recorded against them. O-20 to O-44 were raised from Week 7 and are reconciled against Week 9; O-45 to O-49 record remaining Week 9 gaps and design dependencies; O-50/O-51 record Week 9 assumptions.</w:t>
       </w:r>
     </w:p>
     <w:p>
@@ -15450,6 +15471,58 @@
           <w:p>
             <w:r>
               <w:t>T-94, T-95; E06-S04 owner identified the index consequence; story owner confirmed retry and rejection-chain rules, 2026-10-15</w:t>
+            </w:r>
+          </w:p>
+        </w:tc>
+      </w:tr>
+      <w:tr>
+        <w:tc>
+          <w:tcPr>
+            <w:tcW w:type="dxa" w:w="1728"/>
+          </w:tcPr>
+          <w:p>
+            <w:r>
+              <w:t>T-97</w:t>
+            </w:r>
+          </w:p>
+        </w:tc>
+        <w:tc>
+          <w:tcPr>
+            <w:tcW w:type="dxa" w:w="1728"/>
+          </w:tcPr>
+          <w:p>
+            <w:r>
+              <w:t>Accept bounded demo-account risk, approve two Sprint 3 follow-ups without reopening Done stories, and assign PO accountability for the SCRUM-75 venue-staff mapping</w:t>
+            </w:r>
+          </w:p>
+        </w:tc>
+        <w:tc>
+          <w:tcPr>
+            <w:tcW w:type="dxa" w:w="1728"/>
+          </w:tcPr>
+          <w:p>
+            <w:r>
+              <w:t>On 16 October 2026 the Product Owner explicitly accepted the risk of the existing public/shared `seedCredential` for DEMO ONLY accounts, including the Safety Officer. This is not a security-safety finding, approval to use real data, or approval concerning database, API, service or CI secrets. No rotation or access restriction is selected. The existing seed already defines the Safety Officer and Coordinator Lead (#232); do not change seed code or add accounts. If the approved demo Safety Officer is absent in the intended production project/schema, provision only that one existing seed profile using the reviewed procedure in `docs/ops/demo-account-provisioning.md`, after read-only precheck and coordination with Aaron; otherwise record a no-op. The Product Owner also approves new E14-S03 and E03-S12 follow-ups for Sprint 3. Their acceptance criteria and estimates remain for separate refinement; no E14-specific defect is confirmed by this approval, and story definitions remain in their separate lane. E14-S02, E03-S07 and E03-S11 remain Done. This approval supersedes T-74's historical reopen-if-an-original-criterion-fails exception: under current `CONTRIBUTING.md` and the 6 October instructor guidance, a Done story stays Done and needed changes become new stories. Do not alter T-74's historical text. This is planning approval, not a delivery claim. For SCRUM-75, Bryan is accountable Product Owner for the Venue Staff mapping follow-up; the deploy owner applies only the actual approved mapping with pre/post records and Ji Ning verifies delivery. PR #272's merged notification-routing code is not blocked by the future mapping. No roster assignments are authorised until the mapping is approved, and T-89's no-roster-screen decision remains. The Jira roster subtask belongs to a separate lane; link its key when reported, without guessing it.</w:t>
+            </w:r>
+          </w:p>
+        </w:tc>
+        <w:tc>
+          <w:tcPr>
+            <w:tcW w:type="dxa" w:w="1728"/>
+          </w:tcPr>
+          <w:p>
+            <w:r>
+              <w:t>Demo-only accounts and the one Safety Officer seed profile; E14-S03 / E03-S12 Sprint 3 planning; SCRUM-75 Venue Staff mapping follow-up</w:t>
+            </w:r>
+          </w:p>
+        </w:tc>
+        <w:tc>
+          <w:tcPr>
+            <w:tcW w:type="dxa" w:w="1728"/>
+          </w:tcPr>
+          <w:p>
+            <w:r>
+              <w:t>Product Owner approvals, 2026-10-16; `CONTRIBUTING.md`; instructor guidance, 2026-10-06; T-89; PR #272</w:t>
             </w:r>
           </w:p>
         </w:tc>
@@ -21319,6 +21392,102 @@
     <w:p>
       <w:r>
         <w:t>16 October confirmation below. They remain unimplemented, not delivered.</w:t>
+      </w:r>
+    </w:p>
+    <w:p>
+      <w:pPr>
+        <w:pStyle w:val="Heading2"/>
+      </w:pPr>
+      <w:r>
+        <w:rPr>
+          <w:sz w:val="28"/>
+        </w:rPr>
+        <w:t>16 October 2026: Product Owner approvals (T-97)</w:t>
+      </w:r>
+    </w:p>
+    <w:p>
+      <w:r>
+        <w:t>Recorded the Product Owner's bounded demo-account risk acceptance and approved</w:t>
+      </w:r>
+    </w:p>
+    <w:p>
+      <w:r>
+        <w:t>procedure for the single existing Safety Officer seed profile. The current seed</w:t>
+      </w:r>
+    </w:p>
+    <w:p>
+      <w:r>
+        <w:t>already defines that account and the Coordinator Lead; this decision adds no</w:t>
+      </w:r>
+    </w:p>
+    <w:p>
+      <w:r>
+        <w:t>seed code, account set, credential controls or claim of security safety. Any</w:t>
+      </w:r>
+    </w:p>
+    <w:p>
+      <w:r>
+        <w:t>missing-account operation remains gated by a reviewed mechanism and read-only</w:t>
+      </w:r>
+    </w:p>
+    <w:p>
+      <w:r>
+        <w:t>production precheck; it is not a migration and was not performed here.</w:t>
+      </w:r>
+    </w:p>
+    <w:p>
+      <w:r>
+        <w:t>Approved E14-S03 and E03-S12 as new Sprint 3 follow-ups for separate refinement.</w:t>
+      </w:r>
+    </w:p>
+    <w:p>
+      <w:r>
+        <w:t>E14-S02, E03-S07 and E03-S11 remain Done. T-97 supersedes T-74's historical</w:t>
+      </w:r>
+    </w:p>
+    <w:p>
+      <w:r>
+        <w:t>reopening exception under the current Definition of Done and 6 October</w:t>
+      </w:r>
+    </w:p>
+    <w:p>
+      <w:r>
+        <w:t>instructor guidance; T-74's historical record is retained. This is a planning</w:t>
+      </w:r>
+    </w:p>
+    <w:p>
+      <w:r>
+        <w:t>approval, not a claim of story delivery.</w:t>
+      </w:r>
+    </w:p>
+    <w:p>
+      <w:r>
+        <w:t>Recorded Bryan as accountable PO for the SCRUM-75 Venue Staff mapping follow-up.</w:t>
+      </w:r>
+    </w:p>
+    <w:p>
+      <w:r>
+        <w:t>Only the deploy owner may apply an actual approved mapping with pre/post records,</w:t>
+      </w:r>
+    </w:p>
+    <w:p>
+      <w:r>
+        <w:t>and Ji Ning verifies delivery. PR #272's merged routing code is independent of</w:t>
+      </w:r>
+    </w:p>
+    <w:p>
+      <w:r>
+        <w:t>the mapping; no assignments are authorised until approval. T-89's no-roster-screen</w:t>
+      </w:r>
+    </w:p>
+    <w:p>
+      <w:r>
+        <w:t>decision remains. The Jira subtask key will be linked when reported by its</w:t>
+      </w:r>
+    </w:p>
+    <w:p>
+      <w:r>
+        <w:t>separate lane.</w:t>
       </w:r>
     </w:p>
     <w:p>

</xml_diff>

<commit_message>
docs(bdr): regenerate reconciled decision export
</commit_message>
<xml_diff>
--- a/docs/BACKLOG DECISION REVIEW CAA 161026.docx
+++ b/docs/BACKLOG DECISION REVIEW CAA 161026.docx
@@ -116,7 +116,7 @@
     </w:p>
     <w:p>
       <w:r>
-        <w:t>Recorded the Product Owner's 16 October approvals as T-97. The existing public/shared `seedCredential` risk is accepted for DEMO ONLY accounts, with no security-safety claim, real-data approval, rotation/access restriction selection, or approval of DB/API/service/CI secrets. The current main seed already defines both new roles; the accompanying runbook permits only a targeted, reviewed Safety Officer account operation if a read-only precheck shows that profile is missing, otherwise it records a no-op. Two Sprint 3 follow-ups, E14-S03 and E03-S12, are approved for separate refinement; E14-S02, E03-S07 and E03-S11 stay Done under the current Definition of Done, superseding T-74's historical reopening exception without erasing it. This is planning approval, not delivery evidence. Bryan is accountable PO for the SCRUM-75 Venue Staff mapping follow-up; roster assignments still require an approved actual mapping, and T-89's no-screen decision stands. PR #272's merged routing code is not blocked by that future mapping.</w:t>
+        <w:t>Recorded the Product Owner's 16 October approvals as T-97. The existing public/shared `seedCredential` risk is accepted for DEMO ONLY accounts, not real-data use or database/API/service/CI secrets; no rotation or access restriction was selected. The seed already defines both new roles, but this approval permits only the one missing Safety Officer profile, with a fresh precheck and coordinated writer. Its separate operation record is PR #295. E14-S03 and E03-S12 are selected Sprint 3 follow-ups, unestimated and not Done, with definitions and planned cases in PR #296. E14-S03 will replace raw UTC edited date/time display with readable Singapore time in both existing views while preserving stored audit values and access. E03-S12 will use the shared success Alert while retaining the plain paragraph's existing status semantics, field-specific messages and save/error behavior. Notifications, unrelated labels, global viewing and a new before/after-history feature are excluded. Existing Done stories stay Done even within the same sprint; T-97 supersedes T-74's historical reopening exception without erasing it. SCRUM-195 tracks Bryan's PO ownership of the SCRUM-75 roster follow-up: mapping approval, bounded deploy-owner load and records, then Ji Ning's delivery verification. No mapping or assignment write is approved here, and T-89 remains in force. PR #272 is merged; future roster setup does not block its routing-code merge. Planning and account provisioning are not application-feature acceptance.</w:t>
       </w:r>
     </w:p>
     <w:p>
@@ -15502,27 +15502,27 @@
           </w:tcPr>
           <w:p>
             <w:r>
-              <w:t>On 16 October 2026 the Product Owner explicitly accepted the risk of the existing public/shared `seedCredential` for DEMO ONLY accounts, including the Safety Officer. This is not a security-safety finding, approval to use real data, or approval concerning database, API, service or CI secrets. No rotation or access restriction is selected. The existing seed already defines the Safety Officer and Coordinator Lead (#232); do not change seed code or add accounts. If the approved demo Safety Officer is absent in the intended production project/schema, provision only that one existing seed profile using the reviewed procedure in `docs/ops/demo-account-provisioning.md`, after read-only precheck and coordination with Aaron; otherwise record a no-op. The Product Owner also approves new E14-S03 and E03-S12 follow-ups for Sprint 3. Their acceptance criteria and estimates remain for separate refinement; no E14-specific defect is confirmed by this approval, and story definitions remain in their separate lane. E14-S02, E03-S07 and E03-S11 remain Done. This approval supersedes T-74's historical reopen-if-an-original-criterion-fails exception: under current `CONTRIBUTING.md` and the 6 October instructor guidance, a Done story stays Done and needed changes become new stories. Do not alter T-74's historical text. This is planning approval, not a delivery claim. For SCRUM-75, Bryan is accountable Product Owner for the Venue Staff mapping follow-up; the deploy owner applies only the actual approved mapping with pre/post records and Ji Ning verifies delivery. PR #272's merged notification-routing code is not blocked by the future mapping. No roster assignments are authorised until the mapping is approved, and T-89's no-roster-screen decision remains. The Jira roster subtask belongs to a separate lane; link its key when reported, without guessing it.</w:t>
-            </w:r>
-          </w:p>
-        </w:tc>
-        <w:tc>
-          <w:tcPr>
-            <w:tcW w:type="dxa" w:w="1728"/>
-          </w:tcPr>
-          <w:p>
-            <w:r>
-              <w:t>Demo-only accounts and the one Safety Officer seed profile; E14-S03 / E03-S12 Sprint 3 planning; SCRUM-75 Venue Staff mapping follow-up</w:t>
-            </w:r>
-          </w:p>
-        </w:tc>
-        <w:tc>
-          <w:tcPr>
-            <w:tcW w:type="dxa" w:w="1728"/>
-          </w:tcPr>
-          <w:p>
-            <w:r>
-              <w:t>Product Owner approvals, 2026-10-16; `CONTRIBUTING.md`; instructor guidance, 2026-10-06; T-89; PR #272</w:t>
+              <w:t>On 16 October 2026 the Product Owner accepted the existing public/shared `seedCredential` risk for DEMO ONLY accounts, including the Safety Officer. No rotation or access restriction is selected. This is not a security-safety finding, real-data approval, or an exception for database, API, service or CI secrets. The seed already defines the Safety Officer and Coordinator Lead (#232), so no seed-code addition is needed. Only the approved missing Safety Officer profile may be provisioned under `docs/ops/demo-account-provisioning.md`, after a fresh read-only precheck and designated-writer coordination; an existing compatible account is a no-op. No Coordinator Lead, other account, bulk seed or reset is authorised. The separate operation is recorded in PR #295; documentation review is not represented as having preceded that directly authorised operation. E14-S03 and E03-S12 are selected for Sprint 3, unestimated and not Done; their definitions and planned cases are in PR #296. E14-S03 replaces raw UTC edited date/time display with readable Singapore time in both existing Organiser and assigned Coordinator Activity-log views, without changing stored audit values, immutability or access. Notifications, unrelated labels, a global viewer and a new before/after-history feature are excluded. E03-S12 replaces the current plain success paragraph with the shared success Alert while retaining its existing `role="status"`, field-specific messages, persistence, error handling and permissions. E14-S02, E03-S07 and E03-S11 stay Done, including within the same sprint. Under current `CONTRIBUTING.md` and the 6 October instructor guidance, this supersedes T-74's historical reopening exception without deleting that history or changing original estimates/timestamps. Planning is not delivery evidence. SCRUM-195, under SCRUM-75, tracks Bryan's accountable PO ownership of the Venue Staff roster. The deploy owner may load only an actual PO-approved mapping with pre/post records, and Ji Ning verifies delivery. This decision approves no mapping or assignment write. PR #272 is merged and its routing code is not blocked by that future setup; T-89's no-roster-screen decision remains.</w:t>
+            </w:r>
+          </w:p>
+        </w:tc>
+        <w:tc>
+          <w:tcPr>
+            <w:tcW w:type="dxa" w:w="1728"/>
+          </w:tcPr>
+          <w:p>
+            <w:r>
+              <w:t>Demo-only Safety Officer setup; E14-S03 / E03-S12 Sprint 3 planning; SCRUM-75 / SCRUM-195 roster follow-up</w:t>
+            </w:r>
+          </w:p>
+        </w:tc>
+        <w:tc>
+          <w:tcPr>
+            <w:tcW w:type="dxa" w:w="1728"/>
+          </w:tcPr>
+          <w:p>
+            <w:r>
+              <w:t>Product Owner approvals, 2026-10-16; `CONTRIBUTING.md`; instructor guidance, 2026-10-06; T-72; T-89; PRs #232, #272, #295, #296</w:t>
             </w:r>
           </w:p>
         </w:tc>
@@ -21417,47 +21417,97 @@
     </w:p>
     <w:p>
       <w:r>
-        <w:t>already defines that account and the Coordinator Lead; this decision adds no</w:t>
+        <w:t>already defines that account and the Coordinator Lead; only this one approved</w:t>
       </w:r>
     </w:p>
     <w:p>
       <w:r>
-        <w:t>seed code, account set, credential controls or claim of security safety. Any</w:t>
+        <w:t>missing profile may be provisioned after reviewed procedure and read-only</w:t>
       </w:r>
     </w:p>
     <w:p>
       <w:r>
-        <w:t>missing-account operation remains gated by a reviewed mechanism and read-only</w:t>
+        <w:t>precheck. No seed code change or other account creation is authorised. The</w:t>
       </w:r>
     </w:p>
     <w:p>
       <w:r>
-        <w:t>production precheck; it is not a migration and was not performed here.</w:t>
+        <w:t>existing public/shared credential has no selected rotation or access restriction;</w:t>
       </w:r>
     </w:p>
     <w:p>
       <w:r>
-        <w:t>Approved E14-S03 and E03-S12 as new Sprint 3 follow-ups for separate refinement.</w:t>
+        <w:t>this is not a security-safety or real-data approval. No production account write</w:t>
       </w:r>
     </w:p>
     <w:p>
       <w:r>
-        <w:t>E14-S02, E03-S07 and E03-S11 remain Done. T-97 supersedes T-74's historical</w:t>
+        <w:t>was performed here.</w:t>
       </w:r>
     </w:p>
     <w:p>
       <w:r>
-        <w:t>reopening exception under the current Definition of Done and 6 October</w:t>
+        <w:t>Selected E14-S03 and E03-S12 as Sprint 3 follow-ups, still unestimated and not</w:t>
       </w:r>
     </w:p>
     <w:p>
       <w:r>
-        <w:t>instructor guidance; T-74's historical record is retained. This is a planning</w:t>
+        <w:t>Done, for separate refinement. E14-S03 addresses the confirmed display defect:</w:t>
       </w:r>
     </w:p>
     <w:p>
       <w:r>
-        <w:t>approval, not a claim of story delivery.</w:t>
+        <w:t>the current Organiser and assigned Coordinator Activity logs expose raw UTC</w:t>
+      </w:r>
+    </w:p>
+    <w:p>
+      <w:r>
+        <w:t>edited date/time values; the new story will show readable Singapore time.</w:t>
+      </w:r>
+    </w:p>
+    <w:p>
+      <w:r>
+        <w:t>UTC storage, audit permissions and access</w:t>
+      </w:r>
+    </w:p>
+    <w:p>
+      <w:r>
+        <w:t>remain unchanged; notifications, unrelated labels, global viewing and before/</w:t>
+      </w:r>
+    </w:p>
+    <w:p>
+      <w:r>
+        <w:t>after history are excluded. E03-S12 replaces the current plain success paragraph</w:t>
+      </w:r>
+    </w:p>
+    <w:p>
+      <w:r>
+        <w:t>with the shared success Alert, retaining its existing status semantics and</w:t>
+      </w:r>
+    </w:p>
+    <w:p>
+      <w:r>
+        <w:t>field-specific messages while preserving error, save,</w:t>
+      </w:r>
+    </w:p>
+    <w:p>
+      <w:r>
+        <w:t>persistence and permission behavior. E14-S02, E03-S07 and E03-S11 remain Done.</w:t>
+      </w:r>
+    </w:p>
+    <w:p>
+      <w:r>
+        <w:t>T-97 supersedes T-74's historical reopening exception under the current</w:t>
+      </w:r>
+    </w:p>
+    <w:p>
+      <w:r>
+        <w:t>Definition of Done and 6 October instructor guidance; T-74's history remains</w:t>
+      </w:r>
+    </w:p>
+    <w:p>
+      <w:r>
+        <w:t>unchanged. This is planning approval, not a claim of story delivery.</w:t>
       </w:r>
     </w:p>
     <w:p>
@@ -21467,27 +21517,27 @@
     </w:p>
     <w:p>
       <w:r>
-        <w:t>Only the deploy owner may apply an actual approved mapping with pre/post records,</w:t>
+        <w:t>The separate Jira subtask SCRUM-195 is assigned to Bryan as accountable PO.</w:t>
       </w:r>
     </w:p>
     <w:p>
       <w:r>
-        <w:t>and Ji Ning verifies delivery. PR #272's merged routing code is independent of</w:t>
+        <w:t>This decision approves no roster mapping or load. Only the deploy owner may apply an actual approved mapping</w:t>
       </w:r>
     </w:p>
     <w:p>
       <w:r>
-        <w:t>the mapping; no assignments are authorised until approval. T-89's no-roster-screen</w:t>
+        <w:t>with pre/post records, and Ji Ning verifies delivery. PR #272's merged routing</w:t>
       </w:r>
     </w:p>
     <w:p>
       <w:r>
-        <w:t>decision remains. The Jira subtask key will be linked when reported by its</w:t>
+        <w:t>code is independent of the mapping; no assignments are authorised until</w:t>
       </w:r>
     </w:p>
     <w:p>
       <w:r>
-        <w:t>separate lane.</w:t>
+        <w:t>approval. T-89's no-roster-screen decision remains.</w:t>
       </w:r>
     </w:p>
     <w:p>

</xml_diff>